<commit_message>
Update report and evidence for Spotify project
</commit_message>
<xml_diff>
--- a/docs/LDCW6123_Group13_Coversheet.docx
+++ b/docs/LDCW6123_Group13_Coversheet.docx
@@ -533,11 +533,7 @@
           </w:tcPr>
           <w:p>
             <w:r>
-              <w:rPr>
-                <w:rFonts w:ascii="Arial" w:hAnsi="Arial"/>
-                <w:sz w:val="18"/>
-              </w:rPr>
-              <w:t>Group 13 Netflix Innovation Life Cycle Poster and Interactive Program</w:t>
+              <w:t>Group 13 Spotify and Physical Music Clayton Model and Interactive Program</w:t>
             </w:r>
           </w:p>
         </w:tc>

</xml_diff>